<commit_message>
docs: Limit scope document changes to sections 1 and 2
Keep the original content of the other sections and only update the
title, the project name, the purpose and the system under test.
</commit_message>
<xml_diff>
--- a/Documento de Alcance de Calidad — Apparel Express.docx
+++ b/Documento de Alcance de Calidad — Apparel Express.docx
@@ -171,7 +171,7 @@
           </w:tcPr>
           <w:p>
             <w:r>
-              <w:t>Dante Tárraga</w:t>
+              <w:t>Miguel Angel Nuñez Lozano</w:t>
             </w:r>
           </w:p>
         </w:tc>
@@ -336,7 +336,7 @@
           </w:tcPr>
           <w:p>
             <w:r>
-              <w:t>Dante Tárraga</w:t>
+              <w:t>Estudiante</w:t>
             </w:r>
           </w:p>
         </w:tc>
@@ -378,7 +378,7 @@
           </w:tcPr>
           <w:p>
             <w:r>
-              <w:t>Dante Tárraga</w:t>
+              <w:t>Estudiante</w:t>
             </w:r>
           </w:p>
         </w:tc>
@@ -541,7 +541,7 @@
           </w:tcPr>
           <w:p>
             <w:r>
-              <w:t>1.0 (commit 23e15e7, 07-oct-2026)</w:t>
+              <w:t>1.0 (07-oct-2026)</w:t>
             </w:r>
           </w:p>
         </w:tc>
@@ -650,7 +650,7 @@
     </w:p>
     <w:p>
       <w:r>
-        <w:t xml:space="preserve">Se priorizan los módulos por el daño que causaría un fallo al negocio: si falla el Check Out, la tienda no vende; si falla el panel de administración, la tienda sigue vendiendo pero no puede mantener al día su catálogo ni sus pedidos.</w:t>
+        <w:t xml:space="preserve">Se priorizan los módulos por el daño que causaría un fallo al negocio: si falla el Check Out, la tienda no vende; si falla el Blog, el cliente pierde contenido informativo pero puede comprar.</w:t>
       </w:r>
     </w:p>
     <w:p>
@@ -762,7 +762,7 @@
           </w:tcPr>
           <w:p>
             <w:r>
-              <w:t xml:space="preserve">Crear cuenta, entrar y salir; validación de campos, mensajes de error, usuario bloqueado y acceso según el rol</w:t>
+              <w:t xml:space="preserve">Crear cuenta, entrar y salir; validación de campos y mensajes de error </w:t>
             </w:r>
           </w:p>
         </w:tc>
@@ -814,7 +814,7 @@
           </w:tcPr>
           <w:p>
             <w:r>
-              <w:t xml:space="preserve">Listado y detalle de productos; búsqueda, filtros por categoría y precio, ordenamiento, paginación y stock</w:t>
+              <w:t xml:space="preserve">Listado y detalle de productos; otras funciones (búsqueda, filtros) </w:t>
             </w:r>
           </w:p>
         </w:tc>
@@ -856,37 +856,37 @@
           </w:tcPr>
           <w:p>
             <w:r>
-              <w:t>Admin Panel</w:t>
-            </w:r>
-          </w:p>
-        </w:tc>
-        <w:tc>
-          <w:tcPr>
-            <w:tcW w:w="1872" w:type="dxa"/>
-          </w:tcPr>
-          <w:p>
-            <w:r>
-              <w:t xml:space="preserve">Alta, edición y baja de productos; cambio de estado de pedidos; consulta y bloqueo de usuarios</w:t>
-            </w:r>
-          </w:p>
-        </w:tc>
-        <w:tc>
-          <w:tcPr>
-            <w:tcW w:w="1872" w:type="dxa"/>
-          </w:tcPr>
-          <w:p>
-            <w:r>
-              <w:t>Media</w:t>
-            </w:r>
-          </w:p>
-        </w:tc>
-        <w:tc>
-          <w:tcPr>
-            <w:tcW w:w="1872" w:type="dxa"/>
-          </w:tcPr>
-          <w:p>
-            <w:r>
-              <w:t xml:space="preserve">El catálogo, el stock y los pedidos no se pueden mantener al día</w:t>
+              <w:t>Blog</w:t>
+            </w:r>
+          </w:p>
+        </w:tc>
+        <w:tc>
+          <w:tcPr>
+            <w:tcW w:w="1872" w:type="dxa"/>
+          </w:tcPr>
+          <w:p>
+            <w:r>
+              <w:t xml:space="preserve">Visualización de entradas y navegación</w:t>
+            </w:r>
+          </w:p>
+        </w:tc>
+        <w:tc>
+          <w:tcPr>
+            <w:tcW w:w="1872" w:type="dxa"/>
+          </w:tcPr>
+          <w:p>
+            <w:r>
+              <w:t>Baja</w:t>
+            </w:r>
+          </w:p>
+        </w:tc>
+        <w:tc>
+          <w:tcPr>
+            <w:tcW w:w="1872" w:type="dxa"/>
+          </w:tcPr>
+          <w:p>
+            <w:r>
+              <w:t xml:space="preserve">Se pierde contenido informativo, sin afectar la compra</w:t>
             </w:r>
           </w:p>
         </w:tc>
@@ -920,7 +920,7 @@
             <w:r>
               <w:t xml:space="preserve">Agregar, quitar y cambiar </w:t>
               <w:lastRenderedPageBreak/>
-              <w:t xml:space="preserve">cantidades según el stock; cupones, costo de envío y cálculo del total</w:t>
+              <w:t xml:space="preserve">cantidades; cálculo del total</w:t>
             </w:r>
           </w:p>
         </w:tc>
@@ -976,7 +976,7 @@
           </w:tcPr>
           <w:p>
             <w:r>
-              <w:t xml:space="preserve">Datos de envío, método de envío, pago simulado con tarjetas de prueba y confirmación del pedido</w:t>
+              <w:t xml:space="preserve">Datos del cliente, envío, pago y confirmación del pedido</w:t>
             </w:r>
           </w:p>
         </w:tc>
@@ -1079,7 +1079,7 @@
         </w:numPr>
       </w:pPr>
       <w:r>
-        <w:t xml:space="preserve">Persistencia de datos en Fake Store API: la API no guarda los cambios, así que los usuarios registrados, los pedidos y los cambios del administrador se conservan solo en el navegador.</w:t>
+        <w:t xml:space="preserve">Panel de administración de la tienda y gestión interna: el sitio no ofrece roles de usuario y se prueba solo la parte pública.</w:t>
       </w:r>
     </w:p>
     <w:p>
@@ -1109,7 +1109,7 @@
     </w:p>
     <w:p>
       <w:r>
-        <w:t xml:space="preserve">Apparel Express se prueba desde la interfaz, sin acceso al código, así que los niveles aplicables son integración, sistema y aceptación; el nivel unitario queda fuera.</w:t>
+        <w:t xml:space="preserve">Sauce-Demo se prueba desde la interfaz, sin acceso al código, así que los niveles aplicables son integración, sistema y aceptación; el nivel unitario queda fuera.</w:t>
       </w:r>
     </w:p>
     <w:tbl>
@@ -1253,7 +1253,7 @@
           </w:tcPr>
           <w:p>
             <w:r>
-              <w:t xml:space="preserve">Verificar que catálogo, carrito, Check Out y Fake Store API se transmiten la información correctamente</w:t>
+              <w:t xml:space="preserve">Verificar que catálogo, carrito y Check Out se transmiten la información correctamente</w:t>
             </w:r>
           </w:p>
         </w:tc>
@@ -1445,7 +1445,7 @@
     </w:p>
     <w:p>
       <w:r>
-        <w:t xml:space="preserve">Todo el trabajo del Módulo 1 corre en el sitio público de Apparel Express, con herramientas gratuitas.</w:t>
+        <w:t xml:space="preserve">Todo el trabajo del Módulo 1 corre en el sitio público de Sauce-Demo, con herramientas gratuitas.</w:t>
       </w:r>
     </w:p>
     <w:tbl>
@@ -1503,7 +1503,7 @@
           </w:tcPr>
           <w:p>
             <w:r>
-              <w:t xml:space="preserve">Sitio público de Apparel Express (ecommerce-react-tailwind-seven.vercel.app)</w:t>
+              <w:t xml:space="preserve">Sitio público de Sauce-Demo (sauce-demo.myshopify.com)</w:t>
             </w:r>
           </w:p>
         </w:tc>
@@ -1684,7 +1684,7 @@
           </w:tcPr>
           <w:p>
             <w:r>
-              <w:t>Administrador</w:t>
+              <w:t>Cliente</w:t>
             </w:r>
           </w:p>
         </w:tc>
@@ -1694,7 +1694,7 @@
           </w:tcPr>
           <w:p>
             <w:r>
-              <w:t>admin</w:t>
+              <w:t>miguel_161198@hotmail.com</w:t>
             </w:r>
           </w:p>
         </w:tc>
@@ -1704,7 +1704,7 @@
           </w:tcPr>
           <w:p>
             <w:r>
-              <w:t xml:space="preserve">Panel de administración: productos, pedidos y usuarios</w:t>
+              <w:t xml:space="preserve">Flujos de compra y cuenta</w:t>
             </w:r>
           </w:p>
         </w:tc>
@@ -1716,7 +1716,7 @@
           </w:tcPr>
           <w:p>
             <w:r>
-              <w:t xml:space="preserve">Cliente</w:t>
+              <w:t xml:space="preserve">Administrador (asumido)</w:t>
             </w:r>
           </w:p>
         </w:tc>
@@ -1726,7 +1726,7 @@
           </w:tcPr>
           <w:p>
             <w:r>
-              <w:t>standard_user</w:t>
+              <w:t>-</w:t>
             </w:r>
           </w:p>
         </w:tc>
@@ -1736,167 +1736,7 @@
           </w:tcPr>
           <w:p>
             <w:r>
-              <w:t xml:space="preserve">Flujos de compra y cuenta sin defectos (resultado esperado)</w:t>
-            </w:r>
-          </w:p>
-        </w:tc>
-      </w:tr>
-      <w:tr>
-        <w:tc>
-          <w:tcPr>
-            <w:tcW w:w="3120" w:type="dxa"/>
-          </w:tcPr>
-          <w:p>
-            <w:r>
-              <w:t xml:space="preserve">Cliente (Fake Store API)</w:t>
-            </w:r>
-          </w:p>
-        </w:tc>
-        <w:tc>
-          <w:tcPr>
-            <w:tcW w:w="3120" w:type="dxa"/>
-          </w:tcPr>
-          <w:p>
-            <w:r>
-              <w:t>mor_2314</w:t>
-            </w:r>
-          </w:p>
-        </w:tc>
-        <w:tc>
-          <w:tcPr>
-            <w:tcW w:w="3120" w:type="dxa"/>
-          </w:tcPr>
-          <w:p>
-            <w:r>
-              <w:t xml:space="preserve">Login real contra la API e historial de pedidos de la API</w:t>
-            </w:r>
-          </w:p>
-        </w:tc>
-      </w:tr>
-      <w:tr>
-        <w:tc>
-          <w:tcPr>
-            <w:tcW w:w="3120" w:type="dxa"/>
-          </w:tcPr>
-          <w:p>
-            <w:r>
-              <w:t xml:space="preserve">Cliente con defectos</w:t>
-            </w:r>
-          </w:p>
-        </w:tc>
-        <w:tc>
-          <w:tcPr>
-            <w:tcW w:w="3120" w:type="dxa"/>
-          </w:tcPr>
-          <w:p>
-            <w:r>
-              <w:t>problem_user</w:t>
-            </w:r>
-          </w:p>
-        </w:tc>
-        <w:tc>
-          <w:tcPr>
-            <w:tcW w:w="3120" w:type="dxa"/>
-          </w:tcPr>
-          <w:p>
-            <w:r>
-              <w:t xml:space="preserve">Reproducir defectos intencionales en catálogo y carrito</w:t>
-            </w:r>
-          </w:p>
-        </w:tc>
-      </w:tr>
-      <w:tr>
-        <w:tc>
-          <w:tcPr>
-            <w:tcW w:w="3120" w:type="dxa"/>
-          </w:tcPr>
-          <w:p>
-            <w:r>
-              <w:t xml:space="preserve">Cliente bloqueado</w:t>
-            </w:r>
-          </w:p>
-        </w:tc>
-        <w:tc>
-          <w:tcPr>
-            <w:tcW w:w="3120" w:type="dxa"/>
-          </w:tcPr>
-          <w:p>
-            <w:r>
-              <w:t>locked_out_user</w:t>
-            </w:r>
-          </w:p>
-        </w:tc>
-        <w:tc>
-          <w:tcPr>
-            <w:tcW w:w="3120" w:type="dxa"/>
-          </w:tcPr>
-          <w:p>
-            <w:r>
-              <w:t xml:space="preserve">Validar el mensaje de usuario bloqueado</w:t>
-            </w:r>
-          </w:p>
-        </w:tc>
-      </w:tr>
-      <w:tr>
-        <w:tc>
-          <w:tcPr>
-            <w:tcW w:w="3120" w:type="dxa"/>
-          </w:tcPr>
-          <w:p>
-            <w:r>
-              <w:t xml:space="preserve">Cliente lento</w:t>
-            </w:r>
-          </w:p>
-        </w:tc>
-        <w:tc>
-          <w:tcPr>
-            <w:tcW w:w="3120" w:type="dxa"/>
-          </w:tcPr>
-          <w:p>
-            <w:r>
-              <w:t>slow_user</w:t>
-            </w:r>
-          </w:p>
-        </w:tc>
-        <w:tc>
-          <w:tcPr>
-            <w:tcW w:w="3120" w:type="dxa"/>
-          </w:tcPr>
-          <w:p>
-            <w:r>
-              <w:t xml:space="preserve">Observar el comportamiento con respuestas 3 segundos más lentas</w:t>
-            </w:r>
-          </w:p>
-        </w:tc>
-      </w:tr>
-      <w:tr>
-        <w:tc>
-          <w:tcPr>
-            <w:tcW w:w="3120" w:type="dxa"/>
-          </w:tcPr>
-          <w:p>
-            <w:r>
-              <w:t xml:space="preserve">Cliente con error</w:t>
-            </w:r>
-          </w:p>
-        </w:tc>
-        <w:tc>
-          <w:tcPr>
-            <w:tcW w:w="3120" w:type="dxa"/>
-          </w:tcPr>
-          <w:p>
-            <w:r>
-              <w:t>error_user</w:t>
-            </w:r>
-          </w:p>
-        </w:tc>
-        <w:tc>
-          <w:tcPr>
-            <w:tcW w:w="3120" w:type="dxa"/>
-          </w:tcPr>
-          <w:p>
-            <w:r>
-              <w:t xml:space="preserve">Validar el manejo de un pedido que falla al confirmarse</w:t>
+              <w:t xml:space="preserve">Solo si se confirma que existe acceso administrativo</w:t>
             </w:r>
           </w:p>
         </w:tc>
@@ -1904,7 +1744,7 @@
     </w:tbl>
     <w:p>
       <w:r>
-        <w:t xml:space="preserve">Las contraseñas no se copian en este documento: un documento real tampoco las guarda. Las credenciales, las tarjetas de prueba y los cupones están en el README del repositorio de la aplicación. </w:t>
+        <w:t xml:space="preserve">Las contraseñas no se copian en este documento: un documento real tampoco las guarda, se referencian y se guardan en un gestor aparte. </w:t>
       </w:r>
     </w:p>
     <w:p>
@@ -1958,7 +1798,7 @@
         </w:numPr>
       </w:pPr>
       <w:r>
-        <w:t xml:space="preserve">Apparel Express responde y el estudiante puede crear una cuenta o iniciar sesión.</w:t>
+        <w:t xml:space="preserve">Sauce-Demo responde y el estudiante puede crear una cuenta o iniciar sesión.</w:t>
       </w:r>
     </w:p>
     <w:p>
@@ -2215,7 +2055,7 @@
           </w:tcPr>
           <w:p>
             <w:r>
-              <w:t xml:space="preserve">Fake Store API cambia sus datos (productos o precios) o deja de responder sin aviso</w:t>
+              <w:t xml:space="preserve">El sitio de demostración cambia (productos, precios o funciones) sin aviso</w:t>
             </w:r>
           </w:p>
         </w:tc>
@@ -2267,9 +2107,9 @@
           </w:tcPr>
           <w:p>
             <w:r>
-              <w:t xml:space="preserve">Un comportamiento que parece defecto es una regla de negocio </w:t>
+              <w:t xml:space="preserve">Un comportamiento que parece defecto es una decisión de diseño </w:t>
               <w:lastRenderedPageBreak/>
-              <w:t xml:space="preserve">o un defecto intencional de un usuario de prueba</w:t>
+              <w:t xml:space="preserve">de la plantilla</w:t>
             </w:r>
           </w:p>
         </w:tc>
@@ -2303,7 +2143,7 @@
           </w:tcPr>
           <w:p>
             <w:r>
-              <w:t xml:space="preserve">Revisar las reglas de negocio y las cuentas de prueba del README antes de reportar</w:t>
+              <w:t xml:space="preserve">Revisar la documentación disponible antes de reportar</w:t>
             </w:r>
           </w:p>
         </w:tc>
@@ -2430,37 +2270,37 @@
           </w:tcPr>
           <w:p>
             <w:r>
-              <w:t xml:space="preserve">Los datos de prueba (pedidos, usuarios registrados y cambios del administrador) se pierden al limpiar el navegador</w:t>
-            </w:r>
-          </w:p>
-        </w:tc>
-        <w:tc>
-          <w:tcPr>
-            <w:tcW w:w="1872" w:type="dxa"/>
-          </w:tcPr>
-          <w:p>
-            <w:r>
-              <w:t xml:space="preserve">Media</w:t>
-            </w:r>
-          </w:p>
-        </w:tc>
-        <w:tc>
-          <w:tcPr>
-            <w:tcW w:w="1872" w:type="dxa"/>
-          </w:tcPr>
-          <w:p>
-            <w:r>
-              <w:t>Medio</w:t>
-            </w:r>
-          </w:p>
-        </w:tc>
-        <w:tc>
-          <w:tcPr>
-            <w:tcW w:w="1872" w:type="dxa"/>
-          </w:tcPr>
-          <w:p>
-            <w:r>
-              <w:t xml:space="preserve">Usar el mismo navegador durante el módulo, registrar el estado inicial y anotar los datos creados en cada sesión</w:t>
+              <w:t xml:space="preserve">El flujo de pago de Check Out no se puede completar por ser un sitio de demostración</w:t>
+            </w:r>
+          </w:p>
+        </w:tc>
+        <w:tc>
+          <w:tcPr>
+            <w:tcW w:w="1872" w:type="dxa"/>
+          </w:tcPr>
+          <w:p>
+            <w:r>
+              <w:t xml:space="preserve">Por confirmar</w:t>
+            </w:r>
+          </w:p>
+        </w:tc>
+        <w:tc>
+          <w:tcPr>
+            <w:tcW w:w="1872" w:type="dxa"/>
+          </w:tcPr>
+          <w:p>
+            <w:r>
+              <w:t>Alto</w:t>
+            </w:r>
+          </w:p>
+        </w:tc>
+        <w:tc>
+          <w:tcPr>
+            <w:tcW w:w="1872" w:type="dxa"/>
+          </w:tcPr>
+          <w:p>
+            <w:r>
+              <w:t xml:space="preserve">Confirmar en la exploración hasta dónde llega el flujo y declarar lo no probado</w:t>
             </w:r>
           </w:p>
         </w:tc>
@@ -2483,7 +2323,7 @@
         </w:numPr>
       </w:pPr>
       <w:r>
-        <w:t xml:space="preserve">Apparel Express y Fake Store API se mantienen disponibles y con las funciones descritas durante el módulo.</w:t>
+        <w:t xml:space="preserve">Sauce-Demo se mantiene disponible y con las funciones descritas durante el módulo.</w:t>
       </w:r>
     </w:p>
     <w:p>
@@ -2519,7 +2359,7 @@
         </w:numPr>
       </w:pPr>
       <w:r>
-        <w:t xml:space="preserve">Los roles Invitado, Cliente y Administrador y los usuarios de prueba están definidos en la aplicación; sus credenciales y comportamiento esperado están en el README.</w:t>
+        <w:t xml:space="preserve">Aunque el sitio no tiene roles de usuario, para este documento se asume el rol Administrador.</w:t>
       </w:r>
     </w:p>
     <w:p>
@@ -2602,7 +2442,7 @@
           </w:tcPr>
           <w:p>
             <w:r>
-              <w:t>Dante Tárraga</w:t>
+              <w:t>Estudiante</w:t>
             </w:r>
           </w:p>
         </w:tc>
@@ -2911,31 +2751,11 @@
           <w:rPr>
             <w:rStyle w:val="Hipervnculo"/>
           </w:rPr>
-          <w:t>Apparel Express</w:t>
+          <w:t>Sauce-Demo</w:t>
         </w:r>
       </w:hyperlink>
       <w:r>
-        <w:t xml:space="preserve">: aplicación bajo prueba (https://ecommerce-react-tailwind-seven.vercel.app).</w:t>
-      </w:r>
-    </w:p>
-    <w:p>
-      <w:pPr>
-        <w:pStyle w:val="Prrafodelista"/>
-        <w:numPr>
-          <w:ilvl w:val="0"/>
-          <w:numId w:val="6"/>
-        </w:numPr>
-      </w:pPr>
-      <w:hyperlink r:id="rId9" w:history="1">
-        <w:r>
-          <w:rPr>
-            <w:rStyle w:val="Hipervnculo"/>
-          </w:rPr>
-          <w:t>Fake Store API</w:t>
-        </w:r>
-      </w:hyperlink>
-      <w:r>
-        <w:t xml:space="preserve">: backend de la aplicación (https://fakestoreapi.com/docs).</w:t>
+        <w:t xml:space="preserve">: aplicación bajo prueba.</w:t>
       </w:r>
     </w:p>
     <w:p>

</xml_diff>